<commit_message>
feat: Refactor event detail forms and improve layout for better usability
</commit_message>
<xml_diff>
--- a/documentos/resources/justificativa.docx
+++ b/documentos/resources/justificativa.docx
@@ -993,32 +993,6 @@
         <w:szCs w:val="24"/>
         <w:lang w:val="en-US"/>
       </w:rPr>
-      <w:t>{{divisao}}</w:t>
-    </w:r>
-  </w:p>
-  <w:p>
-    <w:pPr>
-      <w:pStyle w:val="Normal"/>
-      <w:widowControl w:val="false"/>
-      <w:spacing w:lineRule="auto" w:line="240"/>
-      <w:ind w:end="4"/>
-      <w:jc w:val="center"/>
-      <w:rPr>
-        <w:b/>
-        <w:bCs/>
-        <w:sz w:val="24"/>
-        <w:szCs w:val="24"/>
-        <w:lang w:val="en-US"/>
-      </w:rPr>
-    </w:pPr>
-    <w:r>
-      <w:rPr>
-        <w:b/>
-        <w:bCs/>
-        <w:sz w:val="24"/>
-        <w:szCs w:val="24"/>
-        <w:lang w:val="en-US"/>
-      </w:rPr>
       <w:t>{{unidade}}</w:t>
     </w:r>
   </w:p>
@@ -1125,32 +1099,6 @@
         <w:szCs w:val="24"/>
       </w:rPr>
       <w:t>POLÍCIA CIVIL DO PARANÁ</w:t>
-    </w:r>
-  </w:p>
-  <w:p>
-    <w:pPr>
-      <w:pStyle w:val="Normal"/>
-      <w:widowControl w:val="false"/>
-      <w:spacing w:lineRule="auto" w:line="240"/>
-      <w:ind w:end="4"/>
-      <w:jc w:val="center"/>
-      <w:rPr>
-        <w:b/>
-        <w:bCs/>
-        <w:sz w:val="24"/>
-        <w:szCs w:val="24"/>
-        <w:lang w:val="en-US"/>
-      </w:rPr>
-    </w:pPr>
-    <w:r>
-      <w:rPr>
-        <w:b/>
-        <w:bCs/>
-        <w:sz w:val="24"/>
-        <w:szCs w:val="24"/>
-        <w:lang w:val="en-US"/>
-      </w:rPr>
-      <w:t>{{divisao}}</w:t>
     </w:r>
   </w:p>
   <w:p>
@@ -1582,6 +1530,7 @@
     <w:qFormat/>
     <w:pPr>
       <w:widowControl/>
+      <w:suppressAutoHyphens w:val="true"/>
       <w:bidi w:val="0"/>
       <w:spacing w:lineRule="auto" w:line="276" w:before="0" w:after="0"/>
       <w:jc w:val="start"/>
@@ -1775,6 +1724,32 @@
       <w:rFonts w:cs="Lucida Sans"/>
     </w:rPr>
   </w:style>
+  <w:style w:type="paragraph" w:styleId="Ttulouser">
+    <w:name w:val="Título (user)"/>
+    <w:basedOn w:val="Normal"/>
+    <w:next w:val="BodyText"/>
+    <w:qFormat/>
+    <w:pPr>
+      <w:keepNext w:val="true"/>
+      <w:spacing w:before="240" w:after="120"/>
+    </w:pPr>
+    <w:rPr>
+      <w:rFonts w:ascii="Liberation Sans" w:hAnsi="Liberation Sans" w:eastAsia="Microsoft YaHei" w:cs="Lucida Sans"/>
+      <w:sz w:val="28"/>
+      <w:szCs w:val="28"/>
+    </w:rPr>
+  </w:style>
+  <w:style w:type="paragraph" w:styleId="ndiceuser">
+    <w:name w:val="Índice (user)"/>
+    <w:basedOn w:val="Normal"/>
+    <w:qFormat/>
+    <w:pPr>
+      <w:suppressLineNumbers/>
+    </w:pPr>
+    <w:rPr>
+      <w:rFonts w:cs="Lucida Sans"/>
+    </w:rPr>
+  </w:style>
   <w:style w:type="paragraph" w:styleId="Title">
     <w:name w:val="Title"/>
     <w:basedOn w:val="Normal"/>
@@ -1808,6 +1783,13 @@
       <w:szCs w:val="30"/>
     </w:rPr>
   </w:style>
+  <w:style w:type="paragraph" w:styleId="Cabealhoerodapuser">
+    <w:name w:val="Cabeçalho e rodapé (user)"/>
+    <w:basedOn w:val="Normal"/>
+    <w:qFormat/>
+    <w:pPr/>
+    <w:rPr/>
+  </w:style>
   <w:style w:type="paragraph" w:styleId="Cabealhoerodap">
     <w:name w:val="Cabeçalho e rodapé"/>
     <w:basedOn w:val="Normal"/>
@@ -1817,18 +1799,18 @@
   </w:style>
   <w:style w:type="paragraph" w:styleId="Header">
     <w:name w:val="header"/>
-    <w:basedOn w:val="Cabealhoerodap"/>
+    <w:basedOn w:val="Cabealhoerodapuser"/>
     <w:pPr/>
     <w:rPr/>
   </w:style>
   <w:style w:type="paragraph" w:styleId="Footer">
     <w:name w:val="footer"/>
-    <w:basedOn w:val="Cabealhoerodap"/>
+    <w:basedOn w:val="Cabealhoerodapuser"/>
     <w:pPr/>
     <w:rPr/>
   </w:style>
-  <w:style w:type="numbering" w:styleId="Semlista" w:default="1">
-    <w:name w:val="Sem lista"/>
+  <w:style w:type="numbering" w:styleId="Semlistauser" w:default="1">
+    <w:name w:val="Sem lista (user)"/>
     <w:uiPriority w:val="99"/>
     <w:semiHidden/>
     <w:unhideWhenUsed/>

</xml_diff>